<commit_message>
Add UK occupation-level evidence to manuscript
Co-Authored-By: Claude Sonnet 5.5 <noreply@anthropic.com>
Claude-Session: https://claude.ai/code/session_01H4JvRLBkzRHsy6jU5TcEWv
</commit_message>
<xml_diff>
--- a/isr_paper/ISR_Paper_Generative_Visual_AI_Creative_Labor.docx
+++ b/isr_paper/ISR_Paper_Generative_Visual_AI_Creative_Labor.docx
@@ -67,7 +67,7 @@
           <w:sz w:val="22"/>
           <w:szCs w:val="22"/>
         </w:rPr>
-        <w:t xml:space="preserve">This is a working-paper draft, not a submission-ready empirical paper. It contains a task-based model, a measurement design, and exploratory evidence from open aggregate data. The firm- and occupation-level data that would allow causal tests (for example Lightcast postings) were not available. The exploratory evidence is mixed and does not identify an effect of generative visual AI. Occupation-level classification of visual-content-creation tasks was run on O*NET but its validation against human coders is pending (Section 4.3); no result in this draft depends on it. Model release dates and bibliographic details marked † must be verified before circulation.</w:t>
+        <w:t xml:space="preserve">This is a working-paper draft, not a submission-ready empirical paper. It contains a task-based model, a measurement design, and exploratory evidence from three open data sources: UK online job adverts by occupation, US postings by sector, and European employment by industry. Firm-level data and licensed posting data (for example Lightcast) were not available. The evidence is exploratory and mixed, and it does not identify an effect of generative visual AI. The O*NET-based classification of visual-content-creation tasks is not validated (Section 4.3), and no result in this draft depends on it. Model release dates and bibliographic details marked † must be verified before circulation.</w:t>
       </w:r>
     </w:p>
     <w:p>
@@ -102,7 +102,7 @@
           <w:sz w:val="24"/>
           <w:szCs w:val="24"/>
         </w:rPr>
-        <w:t xml:space="preserve">Generative AI that creates images and video makes visual content nearly free to produce, but whether it displaces creative workers depends on whether its output is good enough for the task and on how much extra content cheaper production induces. We model each visual asset as a choice between human production and AI production with human review, so that substitution requires an acceptance rate above a threshold set by review cost relative to human cost, and cheaper assets raise demand for direction and curation. We examine US online job postings by sector (2020–2026) and European employment by industry (2015–2025) around successive image- and video-generation releases. Postings in creative sectors fell more than in most sectors after 2022, but no more than in technology sectors, and European creative-industry employment did not decline. The evidence neither shows nor rules out displacement, and we specify the occupation-level data needed to discriminate.</w:t>
+        <w:t xml:space="preserve">Generative AI that creates images and video makes visual content nearly free to produce, but whether it displaces creative workers depends on whether its output is good enough and on how much extra content cheaper production induces. We model each visual asset as a choice between human production and AI production with human review: substitution requires an acceptance rate above a threshold set by review cost relative to human cost, while cheaper assets raise demand for direction and curation. Using UK online job adverts by occupation (2017–2026), US postings by sector, and European employment by industry, we find that adverts for image-production occupations fell 0.2 to 0.4 log points more than for other occupations after mid-2022, concentrated in web and graphic design. Creative-direction roles fell less, European creative-industry employment did not decline, and placebo design occupations also fell, so we do not attribute the decline to generative AI.</w:t>
       </w:r>
     </w:p>
     <w:p>
@@ -216,7 +216,7 @@
           <w:sz w:val="24"/>
           <w:szCs w:val="24"/>
         </w:rPr>
-        <w:t xml:space="preserve">We make three contributions. First, we propose a task-level model in which substitution is governed by an acceptance-rate threshold rather than by a task-volume threshold, and in which the net effect on creative labor combines a substitution effect and a scale effect. This differs from fixed-cost models of AI adoption, in which a high cost of building a bespoke system is spread over task volume. For generative visual AI the fixed and marginal costs of producing an asset are both small, so the binding constraint is quality. Second, we design a measurement approach based on O*NET task statements that classifies tasks by whether they involve producing or editing visual content. Third, we bring together two open aggregate data sources, US job postings by occupational sector and European employment by industry, and report what they do and do not show.</w:t>
+        <w:t xml:space="preserve">We make three contributions. First, we propose a task-level model in which substitution is governed by an acceptance-rate threshold rather than by a task-volume threshold, and in which the net effect on creative labor combines a substitution effect and a scale effect. This differs from fixed-cost models of AI adoption, in which a high cost of building a bespoke system is spread over task volume. For generative visual AI the fixed and marginal costs of producing an asset are both small, so the binding constraint is quality. Second, we design a measurement approach based on O*NET task statements that classifies tasks by whether they involve producing or editing visual content. Third, we bring together three open data sources, UK online job adverts by occupation, US postings by sector, and European employment by industry, and report what they do and do not show.</w:t>
       </w:r>
     </w:p>
     <w:p>
@@ -231,7 +231,7 @@
           <w:sz w:val="24"/>
           <w:szCs w:val="24"/>
         </w:rPr>
-        <w:t xml:space="preserve">We are explicit about what the evidence supports. In US postings, creative sectors fell relative to most sectors after 2022, but technology sectors fell as much or more over the same period, and the pre-period trend of creative sectors was steeper. In European employment, creative industries did not decline. Neither source separates image-generation effects from concurrent macroeconomic and text-generation effects, and neither observes occupations within sectors. We therefore treat the empirical section as exploratory, and we state the occupation-level data and design that would test the model’s distinct predictions.</w:t>
+        <w:t xml:space="preserve">We are explicit about what the evidence supports. In UK adverts by occupation, image-production occupations fell more than other occupations from mid-2022 onward, and creative-direction roles fell less. But the decline is concentrated in web and graphic design, design occupations that image generators do not target also fell, and image-production occupations were already declining relative to others in the COVID period. In US sector postings, creative sectors fell no more than technology sectors. In European employment, creative industries did not decline. None of the sources separates image-generation effects from concurrent macroeconomic and text-generation effects. We therefore treat the empirical section as exploratory.</w:t>
       </w:r>
     </w:p>
     <w:p>
@@ -1097,7 +1097,7 @@
                 <w:sz w:val="20"/>
                 <w:szCs w:val="20"/>
               </w:rPr>
-              <w:t xml:space="preserve">Occupation-level postings fall most in stock imagery, routine graphics, and simple illustration, least in brand and creative-direction roles. Not testable with current data.</w:t>
+              <w:t xml:space="preserve">Occupation-level adverts fall more for production roles than for creative-direction roles (testable with UK occupation data); within production, they fall most for stock imagery and routine graphics (not testable with current data).</w:t>
             </w:r>
           </w:p>
         </w:tc>
@@ -1301,7 +1301,7 @@
                 <w:sz w:val="20"/>
                 <w:szCs w:val="20"/>
               </w:rPr>
-              <w:t xml:space="preserve">Gap between creative and other sectors widens after each release, with video roles responding to video releases. Partly testable with sector data.</w:t>
+              <w:t xml:space="preserve">Gap between creative and other occupations widens after each release, with video roles responding to video releases. Partly testable with UK occupation data.</w:t>
             </w:r>
           </w:p>
         </w:tc>
@@ -1367,15 +1367,15 @@
           <w:sz w:val="24"/>
           <w:szCs w:val="24"/>
         </w:rPr>
-        <w:t xml:space="preserve">US job postings by sector.</w:t>
-      </w:r>
-      <w:r>
-        <w:rPr>
-          <w:rFonts w:ascii="Times New Roman" w:cs="Times New Roman" w:eastAsia="Times New Roman" w:hAnsi="Times New Roman"/>
-          <w:sz w:val="24"/>
-          <w:szCs w:val="24"/>
-        </w:rPr>
-        <w:t xml:space="preserve"> We use the Indeed Hiring Lab Job Postings Index, which reports the seasonally adjusted number of total postings on Indeed in the United States relative to February 1, 2020 (index = 100), daily, for 47 occupational sectors from February 2020 to September 2026. Sectors are an Indeed categorization based on normalized job titles. The sector Arts &amp; Entertainment is illustrated by job titles such as designer and artist, Media &amp; Communications by photographer and writer, and Marketing by marketing manager and digital marketer. We aggregate to monthly means of the log index. The data are released under a Creative Commons Attribution 4.0 license.</w:t>
+        <w:t xml:space="preserve">UK online job adverts by occupation.</w:t>
+      </w:r>
+      <w:r>
+        <w:rPr>
+          <w:rFonts w:ascii="Times New Roman" w:cs="Times New Roman" w:eastAsia="Times New Roman" w:hAnsi="Times New Roman"/>
+          <w:sz w:val="24"/>
+          <w:szCs w:val="24"/>
+        </w:rPr>
+        <w:t xml:space="preserve"> We use the Office for National Statistics (ONS) experimental series Labour Demand Volumes by Standard Occupational Classification (SOC 2020), built from Textkernel data. It reports the number of new online job adverts in the United Kingdom each month from January 2017 to August 2026 for 413 four-digit SOC unit groups. The ONS assigns each advert to an occupation by matching its job title to a taxonomy. The series is experimental. Several months have suppressed or missing cells (all occupations for March 2026; many occupations for June and July 2025 and June 2026), which we fill by linear interpolation for up to two consecutive months. The data are released under the Open Government Licence.</w:t>
       </w:r>
     </w:p>
     <w:p>
@@ -1392,6 +1392,31 @@
           <w:sz w:val="24"/>
           <w:szCs w:val="24"/>
         </w:rPr>
+        <w:t xml:space="preserve">US job postings by sector.</w:t>
+      </w:r>
+      <w:r>
+        <w:rPr>
+          <w:rFonts w:ascii="Times New Roman" w:cs="Times New Roman" w:eastAsia="Times New Roman" w:hAnsi="Times New Roman"/>
+          <w:sz w:val="24"/>
+          <w:szCs w:val="24"/>
+        </w:rPr>
+        <w:t xml:space="preserve"> We use the Indeed Hiring Lab Job Postings Index, which reports the seasonally adjusted number of total postings on Indeed in the United States relative to February 1, 2020 (index = 100), daily, for 47 occupational sectors from February 2020 to September 2026. Sectors are an Indeed categorization based on normalized job titles. The sector Arts &amp; Entertainment is illustrated by job titles such as designer and artist, Media &amp; Communications by photographer and writer, and Marketing by marketing manager and digital marketer. We aggregate to monthly means of the log index. The data are released under a Creative Commons Attribution 4.0 license.</w:t>
+      </w:r>
+    </w:p>
+    <w:p>
+      <w:pPr>
+        <w:spacing w:after="0" w:line="480" w:lineRule="auto"/>
+        <w:ind w:firstLine="720"/>
+        <w:jc w:val="left"/>
+      </w:pPr>
+      <w:r>
+        <w:rPr>
+          <w:rFonts w:ascii="Times New Roman" w:cs="Times New Roman" w:eastAsia="Times New Roman" w:hAnsi="Times New Roman"/>
+          <w:i/>
+          <w:iCs/>
+          <w:sz w:val="24"/>
+          <w:szCs w:val="24"/>
+        </w:rPr>
         <w:t xml:space="preserve">European employment by industry.</w:t>
       </w:r>
       <w:r>
@@ -1437,6 +1462,75 @@
     </w:p>
     <w:p>
       <w:pPr>
+        <w:spacing w:after="0" w:line="480" w:lineRule="auto"/>
+        <w:ind w:firstLine="720"/>
+        <w:jc w:val="left"/>
+      </w:pPr>
+      <w:r>
+        <w:rPr>
+          <w:rFonts w:ascii="Times New Roman" w:cs="Times New Roman" w:eastAsia="Times New Roman" w:hAnsi="Times New Roman"/>
+          <w:sz w:val="24"/>
+          <w:szCs w:val="24"/>
+        </w:rPr>
+        <w:t xml:space="preserve">In the UK data we fix three occupational groups from occupation labels alone, before looking at outcomes. </w:t>
+      </w:r>
+      <w:r>
+        <w:rPr>
+          <w:rFonts w:ascii="Times New Roman" w:cs="Times New Roman" w:eastAsia="Times New Roman" w:hAnsi="Times New Roman"/>
+          <w:i/>
+          <w:iCs/>
+          <w:sz w:val="24"/>
+          <w:szCs w:val="24"/>
+        </w:rPr>
+        <w:t xml:space="preserve">Image and video production</w:t>
+      </w:r>
+      <w:r>
+        <w:rPr>
+          <w:rFonts w:ascii="Times New Roman" w:cs="Times New Roman" w:eastAsia="Times New Roman" w:hAnsi="Times New Roman"/>
+          <w:sz w:val="24"/>
+          <w:szCs w:val="24"/>
+        </w:rPr>
+        <w:t xml:space="preserve"> comprises graphic and multimedia designers (SOC 2142), artists (3411), photographers and audio-visual and broadcasting equipment operators (3417), and web design professionals (2141). </w:t>
+      </w:r>
+      <w:r>
+        <w:rPr>
+          <w:rFonts w:ascii="Times New Roman" w:cs="Times New Roman" w:eastAsia="Times New Roman" w:hAnsi="Times New Roman"/>
+          <w:i/>
+          <w:iCs/>
+          <w:sz w:val="24"/>
+          <w:szCs w:val="24"/>
+        </w:rPr>
+        <w:t xml:space="preserve">Creative direction and production</w:t>
+      </w:r>
+      <w:r>
+        <w:rPr>
+          <w:rFonts w:ascii="Times New Roman" w:cs="Times New Roman" w:eastAsia="Times New Roman" w:hAnsi="Times New Roman"/>
+          <w:sz w:val="24"/>
+          <w:szCs w:val="24"/>
+        </w:rPr>
+        <w:t xml:space="preserve"> comprises arts officers, producers and directors (3416), advertising accounts managers and creative directors (2494), and managers and directors in the creative industries (1255). </w:t>
+      </w:r>
+      <w:r>
+        <w:rPr>
+          <w:rFonts w:ascii="Times New Roman" w:cs="Times New Roman" w:eastAsia="Times New Roman" w:hAnsi="Times New Roman"/>
+          <w:i/>
+          <w:iCs/>
+          <w:sz w:val="24"/>
+          <w:szCs w:val="24"/>
+        </w:rPr>
+        <w:t xml:space="preserve">Text production</w:t>
+      </w:r>
+      <w:r>
+        <w:rPr>
+          <w:rFonts w:ascii="Times New Roman" w:cs="Times New Roman" w:eastAsia="Times New Roman" w:hAnsi="Times New Roman"/>
+          <w:sz w:val="24"/>
+          <w:szCs w:val="24"/>
+        </w:rPr>
+        <w:t xml:space="preserve"> comprises authors, writers and translators (3412), journalists and reporters (2492), and editors (2491). The comparison pool is all other occupations with at least 1,000 new adverts in the base year (395 occupations), and a restricted pool of managerial, professional, and associate-professional occupations (SOC major groups 1 to 3; 249 occupations). As a placebo we use design occupations that image generators do not target: interior designers (3421), clothing, fashion and accessories designers (3422), and design occupations not elsewhere classified (3429).</w:t>
+      </w:r>
+    </w:p>
+    <w:p>
+      <w:pPr>
         <w:pStyle w:val="Heading2"/>
         <w:keepNext/>
         <w:spacing w:after="120" w:before="240" w:line="240" w:lineRule="auto"/>
@@ -1479,7 +1573,7 @@
           <w:sz w:val="24"/>
           <w:szCs w:val="24"/>
         </w:rPr>
-        <w:t xml:space="preserve">This measure has not yet been validated. A full-sample classification is in progress. Validation requires human coding of a stratified sample (tasks scored 1 or 2 plus a sample of tasks scored 0, because a simple random sample would contain almost no positive tasks) and a report of agreement. An earlier attempt to measure a broader construct, dependence of tasks on visual perception, showed weak agreement between a language model and a human coder (Cohen’s κ about 0.2 on 200 tasks) and was discontinued. The creation construct is narrower and more concrete, but we do not assume that it will agree better. No result in Section 6 uses this measure, because the open aggregate data have no occupation dimension.</w:t>
+        <w:t xml:space="preserve">This measure has not yet been validated. A full-sample classification is in progress. Validation requires human coding of a stratified sample (tasks scored 1 or 2 plus a sample of tasks scored 0, because a simple random sample would contain almost no positive tasks) and a report of agreement. An earlier attempt to measure a broader construct, dependence of tasks on visual perception, showed weak agreement between a language model and a human coder (Cohen’s κ about 0.2 on 200 tasks) and was discontinued. The creation construct is narrower and more concrete, but we do not assume that it will agree better. No result in Section 6 uses this measure. The treated occupational groups in the UK data are instead chosen from occupation labels.</w:t>
       </w:r>
     </w:p>
     <w:p>
@@ -1653,6 +1747,38 @@
     </w:p>
     <w:p>
       <w:pPr>
+        <w:pStyle w:val="Heading2"/>
+        <w:keepNext/>
+        <w:spacing w:after="120" w:before="240" w:line="240" w:lineRule="auto"/>
+      </w:pPr>
+      <w:r>
+        <w:rPr>
+          <w:rFonts w:ascii="Times New Roman" w:cs="Times New Roman" w:eastAsia="Times New Roman" w:hAnsi="Times New Roman"/>
+          <w:b/>
+          <w:bCs/>
+          <w:sz w:val="24"/>
+          <w:szCs w:val="24"/>
+        </w:rPr>
+        <w:t xml:space="preserve">5.3 UK Occupation-Level Event Study</w:t>
+      </w:r>
+    </w:p>
+    <w:p>
+      <w:pPr>
+        <w:spacing w:after="0" w:line="480" w:lineRule="auto"/>
+        <w:ind w:firstLine="720"/>
+        <w:jc w:val="left"/>
+      </w:pPr>
+      <w:r>
+        <w:rPr>
+          <w:rFonts w:ascii="Times New Roman" w:cs="Times New Roman" w:eastAsia="Times New Roman" w:hAnsi="Times New Roman"/>
+          <w:sz w:val="24"/>
+          <w:szCs w:val="24"/>
+        </w:rPr>
+        <w:t xml:space="preserve">For each occupation we compute the sum of new adverts over each twelve-month window from July to June, and take logs. The base year is July 2021 to June 2022, which precedes the public release of text-to-image systems (July to August 2022) and of ChatGPT (November 2022). For each later year we compute the log change from the base year for each occupation, and the difference between the mean log change of the occupations in a group and that of the comparison pool. Using annual sums removes seasonality. Inference is by randomization: the p-value is the share of 10,000 random sets of occupations of the same size drawn from the comparison pool that produce a difference at least as large in absolute value. We report leave-one-occupation-out estimates, individual occupations with their rank among all occupations, and the placebo group. Because the series starts in 2017, the pre-period contains the COVID shock, so we cannot use it to test parallel trends cleanly; we report the path of the group gap from 2019 as descriptive evidence.</w:t>
+      </w:r>
+    </w:p>
+    <w:p>
+      <w:pPr>
         <w:pStyle w:val="Heading1"/>
         <w:keepNext/>
         <w:spacing w:after="120" w:before="360" w:line="240" w:lineRule="auto"/>
@@ -1683,7 +1809,7 @@
           <w:sz w:val="24"/>
           <w:szCs w:val="24"/>
         </w:rPr>
-        <w:t xml:space="preserve">6.1 US Postings</w:t>
+        <w:t xml:space="preserve">6.1 UK Occupation-Level Evidence</w:t>
       </w:r>
     </w:p>
     <w:p>
@@ -1698,7 +1824,7 @@
           <w:sz w:val="24"/>
           <w:szCs w:val="24"/>
         </w:rPr>
-        <w:t xml:space="preserve">Table 2 reports the difference in log change between creative and other sectors. Creative sectors fell relative to other sectors in every window after the base. The difference is −0.23 log points in October 2022–March 2023 (randomization p = 0.018) and about −0.31 to −0.33 in later windows (p between 0.049 and 0.077) when all other sectors are the comparison. When the technology and data sectors are excluded from the comparison, the differences are larger and the p-values smaller (−0.26 to −0.39, p between 0.003 and 0.011). The difference between the third and second windows is close to zero (−0.316 versus −0.328 for all other sectors), so there is no additional widening after the release of video-generation systems.</w:t>
+        <w:t xml:space="preserve">Table 2 reports the main result. Relative to other occupations, adverts for image and video production occupations fell by 0.20 log points in the first year after the base year (July 2022 to June 2023; randomization p = 0.032) and by 0.38 log points in the third and fourth years (p = 0.011), when all other occupations are the comparison. The estimates are similar when the comparison is limited to managerial, professional, and associate-professional occupations (−0.22 to −0.39; p between 0.007 and 0.044). Creative direction and production occupations fell by less (−0.11 in the first year and −0.23 in the third; p between 0.15 and 0.27). The difference between image and video production and creative direction is about −0.15 log points in the third year, which has the sign predicted by the quality-threshold hypothesis, but the direction group has only three occupations. Text production occupations did not differ from other occupations in the first two years (−0.10 and +0.03) and fell later (−0.33 in the third year, p = 0.046; −0.47 in the fourth, p = 0.008), led by journalists and editors.</w:t>
       </w:r>
     </w:p>
     <w:p>
@@ -1716,6 +1842,1288 @@
           <w:szCs w:val="22"/>
         </w:rPr>
         <w:t xml:space="preserve">Table 2.</w:t>
+      </w:r>
+      <w:r>
+        <w:rPr>
+          <w:rFonts w:ascii="Times New Roman" w:cs="Times New Roman" w:eastAsia="Times New Roman" w:hAnsi="Times New Roman"/>
+          <w:sz w:val="22"/>
+          <w:szCs w:val="22"/>
+        </w:rPr>
+        <w:t xml:space="preserve"> UK occupations: change in log new adverts (twelve-month sums) from July 2021–June 2022, group minus other occupations</w:t>
+      </w:r>
+    </w:p>
+    <w:tbl>
+      <w:tblPr>
+        <w:tblW w:type="dxa" w:w="9360"/>
+        <w:tblBorders>
+          <w:top w:val="single" w:color="auto" w:sz="4"/>
+          <w:left w:val="single" w:color="auto" w:sz="4"/>
+          <w:bottom w:val="single" w:color="auto" w:sz="4"/>
+          <w:right w:val="single" w:color="auto" w:sz="4"/>
+          <w:insideH w:val="single" w:color="auto" w:sz="4"/>
+          <w:insideV w:val="single" w:color="auto" w:sz="4"/>
+        </w:tblBorders>
+      </w:tblPr>
+      <w:tblGrid>
+        <w:gridCol w:w="2660"/>
+        <w:gridCol w:w="1675"/>
+        <w:gridCol w:w="1675"/>
+        <w:gridCol w:w="1675"/>
+        <w:gridCol w:w="1675"/>
+      </w:tblGrid>
+      <w:tr>
+        <w:trPr>
+          <w:cantSplit/>
+          <w:tblHeader/>
+        </w:trPr>
+        <w:tc>
+          <w:tcPr>
+            <w:tcW w:type="dxa" w:w="2660"/>
+            <w:tcBorders>
+              <w:top w:val="single" w:color="000000" w:sz="4"/>
+              <w:left w:val="none" w:color="FFFFFF" w:sz="0"/>
+              <w:bottom w:val="single" w:color="000000" w:sz="4"/>
+              <w:right w:val="none" w:color="FFFFFF" w:sz="0"/>
+            </w:tcBorders>
+            <w:shd w:fill="EDEDED" w:color="auto" w:val="clear"/>
+            <w:tcMar>
+              <w:top w:type="dxa" w:w="50"/>
+              <w:left w:type="dxa" w:w="90"/>
+              <w:bottom w:type="dxa" w:w="50"/>
+              <w:right w:type="dxa" w:w="90"/>
+            </w:tcMar>
+          </w:tcPr>
+          <w:p>
+            <w:pPr>
+              <w:spacing w:line="240" w:lineRule="auto"/>
+            </w:pPr>
+            <w:r>
+              <w:rPr>
+                <w:rFonts w:ascii="Times New Roman" w:cs="Times New Roman" w:eastAsia="Times New Roman" w:hAnsi="Times New Roman"/>
+                <w:b/>
+                <w:bCs/>
+                <w:sz w:val="20"/>
+                <w:szCs w:val="20"/>
+              </w:rPr>
+              <w:t xml:space="preserve">Group (comparison pool)</w:t>
+            </w:r>
+          </w:p>
+        </w:tc>
+        <w:tc>
+          <w:tcPr>
+            <w:tcW w:type="dxa" w:w="1675"/>
+            <w:tcBorders>
+              <w:top w:val="single" w:color="000000" w:sz="4"/>
+              <w:left w:val="none" w:color="FFFFFF" w:sz="0"/>
+              <w:bottom w:val="single" w:color="000000" w:sz="4"/>
+              <w:right w:val="none" w:color="FFFFFF" w:sz="0"/>
+            </w:tcBorders>
+            <w:shd w:fill="EDEDED" w:color="auto" w:val="clear"/>
+            <w:tcMar>
+              <w:top w:type="dxa" w:w="50"/>
+              <w:left w:type="dxa" w:w="90"/>
+              <w:bottom w:type="dxa" w:w="50"/>
+              <w:right w:type="dxa" w:w="90"/>
+            </w:tcMar>
+          </w:tcPr>
+          <w:p>
+            <w:pPr>
+              <w:spacing w:line="240" w:lineRule="auto"/>
+            </w:pPr>
+            <w:r>
+              <w:rPr>
+                <w:rFonts w:ascii="Times New Roman" w:cs="Times New Roman" w:eastAsia="Times New Roman" w:hAnsi="Times New Roman"/>
+                <w:b/>
+                <w:bCs/>
+                <w:sz w:val="20"/>
+                <w:szCs w:val="20"/>
+              </w:rPr>
+              <w:t xml:space="preserve">Jul22–Jun23</w:t>
+            </w:r>
+          </w:p>
+        </w:tc>
+        <w:tc>
+          <w:tcPr>
+            <w:tcW w:type="dxa" w:w="1675"/>
+            <w:tcBorders>
+              <w:top w:val="single" w:color="000000" w:sz="4"/>
+              <w:left w:val="none" w:color="FFFFFF" w:sz="0"/>
+              <w:bottom w:val="single" w:color="000000" w:sz="4"/>
+              <w:right w:val="none" w:color="FFFFFF" w:sz="0"/>
+            </w:tcBorders>
+            <w:shd w:fill="EDEDED" w:color="auto" w:val="clear"/>
+            <w:tcMar>
+              <w:top w:type="dxa" w:w="50"/>
+              <w:left w:type="dxa" w:w="90"/>
+              <w:bottom w:type="dxa" w:w="50"/>
+              <w:right w:type="dxa" w:w="90"/>
+            </w:tcMar>
+          </w:tcPr>
+          <w:p>
+            <w:pPr>
+              <w:spacing w:line="240" w:lineRule="auto"/>
+            </w:pPr>
+            <w:r>
+              <w:rPr>
+                <w:rFonts w:ascii="Times New Roman" w:cs="Times New Roman" w:eastAsia="Times New Roman" w:hAnsi="Times New Roman"/>
+                <w:b/>
+                <w:bCs/>
+                <w:sz w:val="20"/>
+                <w:szCs w:val="20"/>
+              </w:rPr>
+              <w:t xml:space="preserve">Jul23–Jun24</w:t>
+            </w:r>
+          </w:p>
+        </w:tc>
+        <w:tc>
+          <w:tcPr>
+            <w:tcW w:type="dxa" w:w="1675"/>
+            <w:tcBorders>
+              <w:top w:val="single" w:color="000000" w:sz="4"/>
+              <w:left w:val="none" w:color="FFFFFF" w:sz="0"/>
+              <w:bottom w:val="single" w:color="000000" w:sz="4"/>
+              <w:right w:val="none" w:color="FFFFFF" w:sz="0"/>
+            </w:tcBorders>
+            <w:shd w:fill="EDEDED" w:color="auto" w:val="clear"/>
+            <w:tcMar>
+              <w:top w:type="dxa" w:w="50"/>
+              <w:left w:type="dxa" w:w="90"/>
+              <w:bottom w:type="dxa" w:w="50"/>
+              <w:right w:type="dxa" w:w="90"/>
+            </w:tcMar>
+          </w:tcPr>
+          <w:p>
+            <w:pPr>
+              <w:spacing w:line="240" w:lineRule="auto"/>
+            </w:pPr>
+            <w:r>
+              <w:rPr>
+                <w:rFonts w:ascii="Times New Roman" w:cs="Times New Roman" w:eastAsia="Times New Roman" w:hAnsi="Times New Roman"/>
+                <w:b/>
+                <w:bCs/>
+                <w:sz w:val="20"/>
+                <w:szCs w:val="20"/>
+              </w:rPr>
+              <w:t xml:space="preserve">Jul24–Jun25</w:t>
+            </w:r>
+          </w:p>
+        </w:tc>
+        <w:tc>
+          <w:tcPr>
+            <w:tcW w:type="dxa" w:w="1675"/>
+            <w:tcBorders>
+              <w:top w:val="single" w:color="000000" w:sz="4"/>
+              <w:left w:val="none" w:color="FFFFFF" w:sz="0"/>
+              <w:bottom w:val="single" w:color="000000" w:sz="4"/>
+              <w:right w:val="none" w:color="FFFFFF" w:sz="0"/>
+            </w:tcBorders>
+            <w:shd w:fill="EDEDED" w:color="auto" w:val="clear"/>
+            <w:tcMar>
+              <w:top w:type="dxa" w:w="50"/>
+              <w:left w:type="dxa" w:w="90"/>
+              <w:bottom w:type="dxa" w:w="50"/>
+              <w:right w:type="dxa" w:w="90"/>
+            </w:tcMar>
+          </w:tcPr>
+          <w:p>
+            <w:pPr>
+              <w:spacing w:line="240" w:lineRule="auto"/>
+            </w:pPr>
+            <w:r>
+              <w:rPr>
+                <w:rFonts w:ascii="Times New Roman" w:cs="Times New Roman" w:eastAsia="Times New Roman" w:hAnsi="Times New Roman"/>
+                <w:b/>
+                <w:bCs/>
+                <w:sz w:val="20"/>
+                <w:szCs w:val="20"/>
+              </w:rPr>
+              <w:t xml:space="preserve">Jul25–Jun26</w:t>
+            </w:r>
+          </w:p>
+        </w:tc>
+      </w:tr>
+      <w:tr>
+        <w:trPr>
+          <w:cantSplit/>
+          <w:tblHeader w:val="false"/>
+        </w:trPr>
+        <w:tc>
+          <w:tcPr>
+            <w:tcW w:type="dxa" w:w="2660"/>
+            <w:tcBorders>
+              <w:top w:val="none" w:color="FFFFFF" w:sz="0"/>
+              <w:left w:val="none" w:color="FFFFFF" w:sz="0"/>
+              <w:bottom w:val="none" w:color="FFFFFF" w:sz="0"/>
+              <w:right w:val="none" w:color="FFFFFF" w:sz="0"/>
+            </w:tcBorders>
+            <w:tcMar>
+              <w:top w:type="dxa" w:w="50"/>
+              <w:left w:type="dxa" w:w="90"/>
+              <w:bottom w:type="dxa" w:w="50"/>
+              <w:right w:type="dxa" w:w="90"/>
+            </w:tcMar>
+          </w:tcPr>
+          <w:p>
+            <w:pPr>
+              <w:spacing w:line="240" w:lineRule="auto"/>
+            </w:pPr>
+            <w:r>
+              <w:rPr>
+                <w:rFonts w:ascii="Times New Roman" w:cs="Times New Roman" w:eastAsia="Times New Roman" w:hAnsi="Times New Roman"/>
+                <w:b w:val="false"/>
+                <w:bCs w:val="false"/>
+                <w:sz w:val="20"/>
+                <w:szCs w:val="20"/>
+              </w:rPr>
+              <w:t xml:space="preserve">Image and video production (all)</w:t>
+            </w:r>
+          </w:p>
+        </w:tc>
+        <w:tc>
+          <w:tcPr>
+            <w:tcW w:type="dxa" w:w="1675"/>
+            <w:tcBorders>
+              <w:top w:val="none" w:color="FFFFFF" w:sz="0"/>
+              <w:left w:val="none" w:color="FFFFFF" w:sz="0"/>
+              <w:bottom w:val="none" w:color="FFFFFF" w:sz="0"/>
+              <w:right w:val="none" w:color="FFFFFF" w:sz="0"/>
+            </w:tcBorders>
+            <w:tcMar>
+              <w:top w:type="dxa" w:w="50"/>
+              <w:left w:type="dxa" w:w="90"/>
+              <w:bottom w:type="dxa" w:w="50"/>
+              <w:right w:type="dxa" w:w="90"/>
+            </w:tcMar>
+          </w:tcPr>
+          <w:p>
+            <w:pPr>
+              <w:spacing w:line="240" w:lineRule="auto"/>
+            </w:pPr>
+            <w:r>
+              <w:rPr>
+                <w:rFonts w:ascii="Times New Roman" w:cs="Times New Roman" w:eastAsia="Times New Roman" w:hAnsi="Times New Roman"/>
+                <w:b w:val="false"/>
+                <w:bCs w:val="false"/>
+                <w:sz w:val="20"/>
+                <w:szCs w:val="20"/>
+              </w:rPr>
+              <w:t xml:space="preserve">−0.196 (0.032)</w:t>
+            </w:r>
+          </w:p>
+        </w:tc>
+        <w:tc>
+          <w:tcPr>
+            <w:tcW w:type="dxa" w:w="1675"/>
+            <w:tcBorders>
+              <w:top w:val="none" w:color="FFFFFF" w:sz="0"/>
+              <w:left w:val="none" w:color="FFFFFF" w:sz="0"/>
+              <w:bottom w:val="none" w:color="FFFFFF" w:sz="0"/>
+              <w:right w:val="none" w:color="FFFFFF" w:sz="0"/>
+            </w:tcBorders>
+            <w:tcMar>
+              <w:top w:type="dxa" w:w="50"/>
+              <w:left w:type="dxa" w:w="90"/>
+              <w:bottom w:type="dxa" w:w="50"/>
+              <w:right w:type="dxa" w:w="90"/>
+            </w:tcMar>
+          </w:tcPr>
+          <w:p>
+            <w:pPr>
+              <w:spacing w:line="240" w:lineRule="auto"/>
+            </w:pPr>
+            <w:r>
+              <w:rPr>
+                <w:rFonts w:ascii="Times New Roman" w:cs="Times New Roman" w:eastAsia="Times New Roman" w:hAnsi="Times New Roman"/>
+                <w:b w:val="false"/>
+                <w:bCs w:val="false"/>
+                <w:sz w:val="20"/>
+                <w:szCs w:val="20"/>
+              </w:rPr>
+              <w:t xml:space="preserve">−0.262 (0.047)</w:t>
+            </w:r>
+          </w:p>
+        </w:tc>
+        <w:tc>
+          <w:tcPr>
+            <w:tcW w:type="dxa" w:w="1675"/>
+            <w:tcBorders>
+              <w:top w:val="none" w:color="FFFFFF" w:sz="0"/>
+              <w:left w:val="none" w:color="FFFFFF" w:sz="0"/>
+              <w:bottom w:val="none" w:color="FFFFFF" w:sz="0"/>
+              <w:right w:val="none" w:color="FFFFFF" w:sz="0"/>
+            </w:tcBorders>
+            <w:tcMar>
+              <w:top w:type="dxa" w:w="50"/>
+              <w:left w:type="dxa" w:w="90"/>
+              <w:bottom w:type="dxa" w:w="50"/>
+              <w:right w:type="dxa" w:w="90"/>
+            </w:tcMar>
+          </w:tcPr>
+          <w:p>
+            <w:pPr>
+              <w:spacing w:line="240" w:lineRule="auto"/>
+            </w:pPr>
+            <w:r>
+              <w:rPr>
+                <w:rFonts w:ascii="Times New Roman" w:cs="Times New Roman" w:eastAsia="Times New Roman" w:hAnsi="Times New Roman"/>
+                <w:b w:val="false"/>
+                <w:bCs w:val="false"/>
+                <w:sz w:val="20"/>
+                <w:szCs w:val="20"/>
+              </w:rPr>
+              <w:t xml:space="preserve">−0.378 (0.011)</w:t>
+            </w:r>
+          </w:p>
+        </w:tc>
+        <w:tc>
+          <w:tcPr>
+            <w:tcW w:type="dxa" w:w="1675"/>
+            <w:tcBorders>
+              <w:top w:val="none" w:color="FFFFFF" w:sz="0"/>
+              <w:left w:val="none" w:color="FFFFFF" w:sz="0"/>
+              <w:bottom w:val="none" w:color="FFFFFF" w:sz="0"/>
+              <w:right w:val="none" w:color="FFFFFF" w:sz="0"/>
+            </w:tcBorders>
+            <w:tcMar>
+              <w:top w:type="dxa" w:w="50"/>
+              <w:left w:type="dxa" w:w="90"/>
+              <w:bottom w:type="dxa" w:w="50"/>
+              <w:right w:type="dxa" w:w="90"/>
+            </w:tcMar>
+          </w:tcPr>
+          <w:p>
+            <w:pPr>
+              <w:spacing w:line="240" w:lineRule="auto"/>
+            </w:pPr>
+            <w:r>
+              <w:rPr>
+                <w:rFonts w:ascii="Times New Roman" w:cs="Times New Roman" w:eastAsia="Times New Roman" w:hAnsi="Times New Roman"/>
+                <w:b w:val="false"/>
+                <w:bCs w:val="false"/>
+                <w:sz w:val="20"/>
+                <w:szCs w:val="20"/>
+              </w:rPr>
+              <w:t xml:space="preserve">−0.384 (0.011)</w:t>
+            </w:r>
+          </w:p>
+        </w:tc>
+      </w:tr>
+      <w:tr>
+        <w:trPr>
+          <w:cantSplit/>
+          <w:tblHeader w:val="false"/>
+        </w:trPr>
+        <w:tc>
+          <w:tcPr>
+            <w:tcW w:type="dxa" w:w="2660"/>
+            <w:tcBorders>
+              <w:top w:val="none" w:color="FFFFFF" w:sz="0"/>
+              <w:left w:val="none" w:color="FFFFFF" w:sz="0"/>
+              <w:bottom w:val="none" w:color="FFFFFF" w:sz="0"/>
+              <w:right w:val="none" w:color="FFFFFF" w:sz="0"/>
+            </w:tcBorders>
+            <w:tcMar>
+              <w:top w:type="dxa" w:w="50"/>
+              <w:left w:type="dxa" w:w="90"/>
+              <w:bottom w:type="dxa" w:w="50"/>
+              <w:right w:type="dxa" w:w="90"/>
+            </w:tcMar>
+          </w:tcPr>
+          <w:p>
+            <w:pPr>
+              <w:spacing w:line="240" w:lineRule="auto"/>
+            </w:pPr>
+            <w:r>
+              <w:rPr>
+                <w:rFonts w:ascii="Times New Roman" w:cs="Times New Roman" w:eastAsia="Times New Roman" w:hAnsi="Times New Roman"/>
+                <w:b w:val="false"/>
+                <w:bCs w:val="false"/>
+                <w:sz w:val="20"/>
+                <w:szCs w:val="20"/>
+              </w:rPr>
+              <w:t xml:space="preserve">Image and video production (SOC 1–3)</w:t>
+            </w:r>
+          </w:p>
+        </w:tc>
+        <w:tc>
+          <w:tcPr>
+            <w:tcW w:type="dxa" w:w="1675"/>
+            <w:tcBorders>
+              <w:top w:val="none" w:color="FFFFFF" w:sz="0"/>
+              <w:left w:val="none" w:color="FFFFFF" w:sz="0"/>
+              <w:bottom w:val="none" w:color="FFFFFF" w:sz="0"/>
+              <w:right w:val="none" w:color="FFFFFF" w:sz="0"/>
+            </w:tcBorders>
+            <w:tcMar>
+              <w:top w:type="dxa" w:w="50"/>
+              <w:left w:type="dxa" w:w="90"/>
+              <w:bottom w:type="dxa" w:w="50"/>
+              <w:right w:type="dxa" w:w="90"/>
+            </w:tcMar>
+          </w:tcPr>
+          <w:p>
+            <w:pPr>
+              <w:spacing w:line="240" w:lineRule="auto"/>
+            </w:pPr>
+            <w:r>
+              <w:rPr>
+                <w:rFonts w:ascii="Times New Roman" w:cs="Times New Roman" w:eastAsia="Times New Roman" w:hAnsi="Times New Roman"/>
+                <w:b w:val="false"/>
+                <w:bCs w:val="false"/>
+                <w:sz w:val="20"/>
+                <w:szCs w:val="20"/>
+              </w:rPr>
+              <w:t xml:space="preserve">−0.217 (0.016)</w:t>
+            </w:r>
+          </w:p>
+        </w:tc>
+        <w:tc>
+          <w:tcPr>
+            <w:tcW w:type="dxa" w:w="1675"/>
+            <w:tcBorders>
+              <w:top w:val="none" w:color="FFFFFF" w:sz="0"/>
+              <w:left w:val="none" w:color="FFFFFF" w:sz="0"/>
+              <w:bottom w:val="none" w:color="FFFFFF" w:sz="0"/>
+              <w:right w:val="none" w:color="FFFFFF" w:sz="0"/>
+            </w:tcBorders>
+            <w:tcMar>
+              <w:top w:type="dxa" w:w="50"/>
+              <w:left w:type="dxa" w:w="90"/>
+              <w:bottom w:type="dxa" w:w="50"/>
+              <w:right w:type="dxa" w:w="90"/>
+            </w:tcMar>
+          </w:tcPr>
+          <w:p>
+            <w:pPr>
+              <w:spacing w:line="240" w:lineRule="auto"/>
+            </w:pPr>
+            <w:r>
+              <w:rPr>
+                <w:rFonts w:ascii="Times New Roman" w:cs="Times New Roman" w:eastAsia="Times New Roman" w:hAnsi="Times New Roman"/>
+                <w:b w:val="false"/>
+                <w:bCs w:val="false"/>
+                <w:sz w:val="20"/>
+                <w:szCs w:val="20"/>
+              </w:rPr>
+              <w:t xml:space="preserve">−0.294 (0.044)</w:t>
+            </w:r>
+          </w:p>
+        </w:tc>
+        <w:tc>
+          <w:tcPr>
+            <w:tcW w:type="dxa" w:w="1675"/>
+            <w:tcBorders>
+              <w:top w:val="none" w:color="FFFFFF" w:sz="0"/>
+              <w:left w:val="none" w:color="FFFFFF" w:sz="0"/>
+              <w:bottom w:val="none" w:color="FFFFFF" w:sz="0"/>
+              <w:right w:val="none" w:color="FFFFFF" w:sz="0"/>
+            </w:tcBorders>
+            <w:tcMar>
+              <w:top w:type="dxa" w:w="50"/>
+              <w:left w:type="dxa" w:w="90"/>
+              <w:bottom w:type="dxa" w:w="50"/>
+              <w:right w:type="dxa" w:w="90"/>
+            </w:tcMar>
+          </w:tcPr>
+          <w:p>
+            <w:pPr>
+              <w:spacing w:line="240" w:lineRule="auto"/>
+            </w:pPr>
+            <w:r>
+              <w:rPr>
+                <w:rFonts w:ascii="Times New Roman" w:cs="Times New Roman" w:eastAsia="Times New Roman" w:hAnsi="Times New Roman"/>
+                <w:b w:val="false"/>
+                <w:bCs w:val="false"/>
+                <w:sz w:val="20"/>
+                <w:szCs w:val="20"/>
+              </w:rPr>
+              <w:t xml:space="preserve">−0.381 (0.008)</w:t>
+            </w:r>
+          </w:p>
+        </w:tc>
+        <w:tc>
+          <w:tcPr>
+            <w:tcW w:type="dxa" w:w="1675"/>
+            <w:tcBorders>
+              <w:top w:val="none" w:color="FFFFFF" w:sz="0"/>
+              <w:left w:val="none" w:color="FFFFFF" w:sz="0"/>
+              <w:bottom w:val="none" w:color="FFFFFF" w:sz="0"/>
+              <w:right w:val="none" w:color="FFFFFF" w:sz="0"/>
+            </w:tcBorders>
+            <w:tcMar>
+              <w:top w:type="dxa" w:w="50"/>
+              <w:left w:type="dxa" w:w="90"/>
+              <w:bottom w:type="dxa" w:w="50"/>
+              <w:right w:type="dxa" w:w="90"/>
+            </w:tcMar>
+          </w:tcPr>
+          <w:p>
+            <w:pPr>
+              <w:spacing w:line="240" w:lineRule="auto"/>
+            </w:pPr>
+            <w:r>
+              <w:rPr>
+                <w:rFonts w:ascii="Times New Roman" w:cs="Times New Roman" w:eastAsia="Times New Roman" w:hAnsi="Times New Roman"/>
+                <w:b w:val="false"/>
+                <w:bCs w:val="false"/>
+                <w:sz w:val="20"/>
+                <w:szCs w:val="20"/>
+              </w:rPr>
+              <w:t xml:space="preserve">−0.389 (0.007)</w:t>
+            </w:r>
+          </w:p>
+        </w:tc>
+      </w:tr>
+      <w:tr>
+        <w:trPr>
+          <w:cantSplit/>
+          <w:tblHeader w:val="false"/>
+        </w:trPr>
+        <w:tc>
+          <w:tcPr>
+            <w:tcW w:type="dxa" w:w="2660"/>
+            <w:tcBorders>
+              <w:top w:val="none" w:color="FFFFFF" w:sz="0"/>
+              <w:left w:val="none" w:color="FFFFFF" w:sz="0"/>
+              <w:bottom w:val="none" w:color="FFFFFF" w:sz="0"/>
+              <w:right w:val="none" w:color="FFFFFF" w:sz="0"/>
+            </w:tcBorders>
+            <w:tcMar>
+              <w:top w:type="dxa" w:w="50"/>
+              <w:left w:type="dxa" w:w="90"/>
+              <w:bottom w:type="dxa" w:w="50"/>
+              <w:right w:type="dxa" w:w="90"/>
+            </w:tcMar>
+          </w:tcPr>
+          <w:p>
+            <w:pPr>
+              <w:spacing w:line="240" w:lineRule="auto"/>
+            </w:pPr>
+            <w:r>
+              <w:rPr>
+                <w:rFonts w:ascii="Times New Roman" w:cs="Times New Roman" w:eastAsia="Times New Roman" w:hAnsi="Times New Roman"/>
+                <w:b w:val="false"/>
+                <w:bCs w:val="false"/>
+                <w:sz w:val="20"/>
+                <w:szCs w:val="20"/>
+              </w:rPr>
+              <w:t xml:space="preserve">Creative direction (all)</w:t>
+            </w:r>
+          </w:p>
+        </w:tc>
+        <w:tc>
+          <w:tcPr>
+            <w:tcW w:type="dxa" w:w="1675"/>
+            <w:tcBorders>
+              <w:top w:val="none" w:color="FFFFFF" w:sz="0"/>
+              <w:left w:val="none" w:color="FFFFFF" w:sz="0"/>
+              <w:bottom w:val="none" w:color="FFFFFF" w:sz="0"/>
+              <w:right w:val="none" w:color="FFFFFF" w:sz="0"/>
+            </w:tcBorders>
+            <w:tcMar>
+              <w:top w:type="dxa" w:w="50"/>
+              <w:left w:type="dxa" w:w="90"/>
+              <w:bottom w:type="dxa" w:w="50"/>
+              <w:right w:type="dxa" w:w="90"/>
+            </w:tcMar>
+          </w:tcPr>
+          <w:p>
+            <w:pPr>
+              <w:spacing w:line="240" w:lineRule="auto"/>
+            </w:pPr>
+            <w:r>
+              <w:rPr>
+                <w:rFonts w:ascii="Times New Roman" w:cs="Times New Roman" w:eastAsia="Times New Roman" w:hAnsi="Times New Roman"/>
+                <w:b w:val="false"/>
+                <w:bCs w:val="false"/>
+                <w:sz w:val="20"/>
+                <w:szCs w:val="20"/>
+              </w:rPr>
+              <w:t xml:space="preserve">−0.113 (0.225)</w:t>
+            </w:r>
+          </w:p>
+        </w:tc>
+        <w:tc>
+          <w:tcPr>
+            <w:tcW w:type="dxa" w:w="1675"/>
+            <w:tcBorders>
+              <w:top w:val="none" w:color="FFFFFF" w:sz="0"/>
+              <w:left w:val="none" w:color="FFFFFF" w:sz="0"/>
+              <w:bottom w:val="none" w:color="FFFFFF" w:sz="0"/>
+              <w:right w:val="none" w:color="FFFFFF" w:sz="0"/>
+            </w:tcBorders>
+            <w:tcMar>
+              <w:top w:type="dxa" w:w="50"/>
+              <w:left w:type="dxa" w:w="90"/>
+              <w:bottom w:type="dxa" w:w="50"/>
+              <w:right w:type="dxa" w:w="90"/>
+            </w:tcMar>
+          </w:tcPr>
+          <w:p>
+            <w:pPr>
+              <w:spacing w:line="240" w:lineRule="auto"/>
+            </w:pPr>
+            <w:r>
+              <w:rPr>
+                <w:rFonts w:ascii="Times New Roman" w:cs="Times New Roman" w:eastAsia="Times New Roman" w:hAnsi="Times New Roman"/>
+                <w:b w:val="false"/>
+                <w:bCs w:val="false"/>
+                <w:sz w:val="20"/>
+                <w:szCs w:val="20"/>
+              </w:rPr>
+              <w:t xml:space="preserve">−0.159 (0.268)</w:t>
+            </w:r>
+          </w:p>
+        </w:tc>
+        <w:tc>
+          <w:tcPr>
+            <w:tcW w:type="dxa" w:w="1675"/>
+            <w:tcBorders>
+              <w:top w:val="none" w:color="FFFFFF" w:sz="0"/>
+              <w:left w:val="none" w:color="FFFFFF" w:sz="0"/>
+              <w:bottom w:val="none" w:color="FFFFFF" w:sz="0"/>
+              <w:right w:val="none" w:color="FFFFFF" w:sz="0"/>
+            </w:tcBorders>
+            <w:tcMar>
+              <w:top w:type="dxa" w:w="50"/>
+              <w:left w:type="dxa" w:w="90"/>
+              <w:bottom w:type="dxa" w:w="50"/>
+              <w:right w:type="dxa" w:w="90"/>
+            </w:tcMar>
+          </w:tcPr>
+          <w:p>
+            <w:pPr>
+              <w:spacing w:line="240" w:lineRule="auto"/>
+            </w:pPr>
+            <w:r>
+              <w:rPr>
+                <w:rFonts w:ascii="Times New Roman" w:cs="Times New Roman" w:eastAsia="Times New Roman" w:hAnsi="Times New Roman"/>
+                <w:b w:val="false"/>
+                <w:bCs w:val="false"/>
+                <w:sz w:val="20"/>
+                <w:szCs w:val="20"/>
+              </w:rPr>
+              <w:t xml:space="preserve">−0.230 (0.168)</w:t>
+            </w:r>
+          </w:p>
+        </w:tc>
+        <w:tc>
+          <w:tcPr>
+            <w:tcW w:type="dxa" w:w="1675"/>
+            <w:tcBorders>
+              <w:top w:val="none" w:color="FFFFFF" w:sz="0"/>
+              <w:left w:val="none" w:color="FFFFFF" w:sz="0"/>
+              <w:bottom w:val="none" w:color="FFFFFF" w:sz="0"/>
+              <w:right w:val="none" w:color="FFFFFF" w:sz="0"/>
+            </w:tcBorders>
+            <w:tcMar>
+              <w:top w:type="dxa" w:w="50"/>
+              <w:left w:type="dxa" w:w="90"/>
+              <w:bottom w:type="dxa" w:w="50"/>
+              <w:right w:type="dxa" w:w="90"/>
+            </w:tcMar>
+          </w:tcPr>
+          <w:p>
+            <w:pPr>
+              <w:spacing w:line="240" w:lineRule="auto"/>
+            </w:pPr>
+            <w:r>
+              <w:rPr>
+                <w:rFonts w:ascii="Times New Roman" w:cs="Times New Roman" w:eastAsia="Times New Roman" w:hAnsi="Times New Roman"/>
+                <w:b w:val="false"/>
+                <w:bCs w:val="false"/>
+                <w:sz w:val="20"/>
+                <w:szCs w:val="20"/>
+              </w:rPr>
+              <w:t xml:space="preserve">−0.210 (0.224)</w:t>
+            </w:r>
+          </w:p>
+        </w:tc>
+      </w:tr>
+      <w:tr>
+        <w:trPr>
+          <w:cantSplit/>
+          <w:tblHeader w:val="false"/>
+        </w:trPr>
+        <w:tc>
+          <w:tcPr>
+            <w:tcW w:type="dxa" w:w="2660"/>
+            <w:tcBorders>
+              <w:top w:val="none" w:color="FFFFFF" w:sz="0"/>
+              <w:left w:val="none" w:color="FFFFFF" w:sz="0"/>
+              <w:bottom w:val="none" w:color="FFFFFF" w:sz="0"/>
+              <w:right w:val="none" w:color="FFFFFF" w:sz="0"/>
+            </w:tcBorders>
+            <w:tcMar>
+              <w:top w:type="dxa" w:w="50"/>
+              <w:left w:type="dxa" w:w="90"/>
+              <w:bottom w:type="dxa" w:w="50"/>
+              <w:right w:type="dxa" w:w="90"/>
+            </w:tcMar>
+          </w:tcPr>
+          <w:p>
+            <w:pPr>
+              <w:spacing w:line="240" w:lineRule="auto"/>
+            </w:pPr>
+            <w:r>
+              <w:rPr>
+                <w:rFonts w:ascii="Times New Roman" w:cs="Times New Roman" w:eastAsia="Times New Roman" w:hAnsi="Times New Roman"/>
+                <w:b w:val="false"/>
+                <w:bCs w:val="false"/>
+                <w:sz w:val="20"/>
+                <w:szCs w:val="20"/>
+              </w:rPr>
+              <w:t xml:space="preserve">Creative direction (SOC 1–3)</w:t>
+            </w:r>
+          </w:p>
+        </w:tc>
+        <w:tc>
+          <w:tcPr>
+            <w:tcW w:type="dxa" w:w="1675"/>
+            <w:tcBorders>
+              <w:top w:val="none" w:color="FFFFFF" w:sz="0"/>
+              <w:left w:val="none" w:color="FFFFFF" w:sz="0"/>
+              <w:bottom w:val="none" w:color="FFFFFF" w:sz="0"/>
+              <w:right w:val="none" w:color="FFFFFF" w:sz="0"/>
+            </w:tcBorders>
+            <w:tcMar>
+              <w:top w:type="dxa" w:w="50"/>
+              <w:left w:type="dxa" w:w="90"/>
+              <w:bottom w:type="dxa" w:w="50"/>
+              <w:right w:type="dxa" w:w="90"/>
+            </w:tcMar>
+          </w:tcPr>
+          <w:p>
+            <w:pPr>
+              <w:spacing w:line="240" w:lineRule="auto"/>
+            </w:pPr>
+            <w:r>
+              <w:rPr>
+                <w:rFonts w:ascii="Times New Roman" w:cs="Times New Roman" w:eastAsia="Times New Roman" w:hAnsi="Times New Roman"/>
+                <w:b w:val="false"/>
+                <w:bCs w:val="false"/>
+                <w:sz w:val="20"/>
+                <w:szCs w:val="20"/>
+              </w:rPr>
+              <w:t xml:space="preserve">−0.134 (0.149)</w:t>
+            </w:r>
+          </w:p>
+        </w:tc>
+        <w:tc>
+          <w:tcPr>
+            <w:tcW w:type="dxa" w:w="1675"/>
+            <w:tcBorders>
+              <w:top w:val="none" w:color="FFFFFF" w:sz="0"/>
+              <w:left w:val="none" w:color="FFFFFF" w:sz="0"/>
+              <w:bottom w:val="none" w:color="FFFFFF" w:sz="0"/>
+              <w:right w:val="none" w:color="FFFFFF" w:sz="0"/>
+            </w:tcBorders>
+            <w:tcMar>
+              <w:top w:type="dxa" w:w="50"/>
+              <w:left w:type="dxa" w:w="90"/>
+              <w:bottom w:type="dxa" w:w="50"/>
+              <w:right w:type="dxa" w:w="90"/>
+            </w:tcMar>
+          </w:tcPr>
+          <w:p>
+            <w:pPr>
+              <w:spacing w:line="240" w:lineRule="auto"/>
+            </w:pPr>
+            <w:r>
+              <w:rPr>
+                <w:rFonts w:ascii="Times New Roman" w:cs="Times New Roman" w:eastAsia="Times New Roman" w:hAnsi="Times New Roman"/>
+                <w:b w:val="false"/>
+                <w:bCs w:val="false"/>
+                <w:sz w:val="20"/>
+                <w:szCs w:val="20"/>
+              </w:rPr>
+              <w:t xml:space="preserve">−0.191 (0.211)</w:t>
+            </w:r>
+          </w:p>
+        </w:tc>
+        <w:tc>
+          <w:tcPr>
+            <w:tcW w:type="dxa" w:w="1675"/>
+            <w:tcBorders>
+              <w:top w:val="none" w:color="FFFFFF" w:sz="0"/>
+              <w:left w:val="none" w:color="FFFFFF" w:sz="0"/>
+              <w:bottom w:val="none" w:color="FFFFFF" w:sz="0"/>
+              <w:right w:val="none" w:color="FFFFFF" w:sz="0"/>
+            </w:tcBorders>
+            <w:tcMar>
+              <w:top w:type="dxa" w:w="50"/>
+              <w:left w:type="dxa" w:w="90"/>
+              <w:bottom w:type="dxa" w:w="50"/>
+              <w:right w:type="dxa" w:w="90"/>
+            </w:tcMar>
+          </w:tcPr>
+          <w:p>
+            <w:pPr>
+              <w:spacing w:line="240" w:lineRule="auto"/>
+            </w:pPr>
+            <w:r>
+              <w:rPr>
+                <w:rFonts w:ascii="Times New Roman" w:cs="Times New Roman" w:eastAsia="Times New Roman" w:hAnsi="Times New Roman"/>
+                <w:b w:val="false"/>
+                <w:bCs w:val="false"/>
+                <w:sz w:val="20"/>
+                <w:szCs w:val="20"/>
+              </w:rPr>
+              <w:t xml:space="preserve">−0.233 (0.159)</w:t>
+            </w:r>
+          </w:p>
+        </w:tc>
+        <w:tc>
+          <w:tcPr>
+            <w:tcW w:type="dxa" w:w="1675"/>
+            <w:tcBorders>
+              <w:top w:val="none" w:color="FFFFFF" w:sz="0"/>
+              <w:left w:val="none" w:color="FFFFFF" w:sz="0"/>
+              <w:bottom w:val="none" w:color="FFFFFF" w:sz="0"/>
+              <w:right w:val="none" w:color="FFFFFF" w:sz="0"/>
+            </w:tcBorders>
+            <w:tcMar>
+              <w:top w:type="dxa" w:w="50"/>
+              <w:left w:type="dxa" w:w="90"/>
+              <w:bottom w:type="dxa" w:w="50"/>
+              <w:right w:type="dxa" w:w="90"/>
+            </w:tcMar>
+          </w:tcPr>
+          <w:p>
+            <w:pPr>
+              <w:spacing w:line="240" w:lineRule="auto"/>
+            </w:pPr>
+            <w:r>
+              <w:rPr>
+                <w:rFonts w:ascii="Times New Roman" w:cs="Times New Roman" w:eastAsia="Times New Roman" w:hAnsi="Times New Roman"/>
+                <w:b w:val="false"/>
+                <w:bCs w:val="false"/>
+                <w:sz w:val="20"/>
+                <w:szCs w:val="20"/>
+              </w:rPr>
+              <w:t xml:space="preserve">−0.216 (0.179)</w:t>
+            </w:r>
+          </w:p>
+        </w:tc>
+      </w:tr>
+      <w:tr>
+        <w:trPr>
+          <w:cantSplit/>
+          <w:tblHeader w:val="false"/>
+        </w:trPr>
+        <w:tc>
+          <w:tcPr>
+            <w:tcW w:type="dxa" w:w="2660"/>
+            <w:tcBorders>
+              <w:top w:val="none" w:color="FFFFFF" w:sz="0"/>
+              <w:left w:val="none" w:color="FFFFFF" w:sz="0"/>
+              <w:bottom w:val="none" w:color="FFFFFF" w:sz="0"/>
+              <w:right w:val="none" w:color="FFFFFF" w:sz="0"/>
+            </w:tcBorders>
+            <w:tcMar>
+              <w:top w:type="dxa" w:w="50"/>
+              <w:left w:type="dxa" w:w="90"/>
+              <w:bottom w:type="dxa" w:w="50"/>
+              <w:right w:type="dxa" w:w="90"/>
+            </w:tcMar>
+          </w:tcPr>
+          <w:p>
+            <w:pPr>
+              <w:spacing w:line="240" w:lineRule="auto"/>
+            </w:pPr>
+            <w:r>
+              <w:rPr>
+                <w:rFonts w:ascii="Times New Roman" w:cs="Times New Roman" w:eastAsia="Times New Roman" w:hAnsi="Times New Roman"/>
+                <w:b w:val="false"/>
+                <w:bCs w:val="false"/>
+                <w:sz w:val="20"/>
+                <w:szCs w:val="20"/>
+              </w:rPr>
+              <w:t xml:space="preserve">Text production (all)</w:t>
+            </w:r>
+          </w:p>
+        </w:tc>
+        <w:tc>
+          <w:tcPr>
+            <w:tcW w:type="dxa" w:w="1675"/>
+            <w:tcBorders>
+              <w:top w:val="none" w:color="FFFFFF" w:sz="0"/>
+              <w:left w:val="none" w:color="FFFFFF" w:sz="0"/>
+              <w:bottom w:val="none" w:color="FFFFFF" w:sz="0"/>
+              <w:right w:val="none" w:color="FFFFFF" w:sz="0"/>
+            </w:tcBorders>
+            <w:tcMar>
+              <w:top w:type="dxa" w:w="50"/>
+              <w:left w:type="dxa" w:w="90"/>
+              <w:bottom w:type="dxa" w:w="50"/>
+              <w:right w:type="dxa" w:w="90"/>
+            </w:tcMar>
+          </w:tcPr>
+          <w:p>
+            <w:pPr>
+              <w:spacing w:line="240" w:lineRule="auto"/>
+            </w:pPr>
+            <w:r>
+              <w:rPr>
+                <w:rFonts w:ascii="Times New Roman" w:cs="Times New Roman" w:eastAsia="Times New Roman" w:hAnsi="Times New Roman"/>
+                <w:b w:val="false"/>
+                <w:bCs w:val="false"/>
+                <w:sz w:val="20"/>
+                <w:szCs w:val="20"/>
+              </w:rPr>
+              <w:t xml:space="preserve">−0.098 (0.279)</w:t>
+            </w:r>
+          </w:p>
+        </w:tc>
+        <w:tc>
+          <w:tcPr>
+            <w:tcW w:type="dxa" w:w="1675"/>
+            <w:tcBorders>
+              <w:top w:val="none" w:color="FFFFFF" w:sz="0"/>
+              <w:left w:val="none" w:color="FFFFFF" w:sz="0"/>
+              <w:bottom w:val="none" w:color="FFFFFF" w:sz="0"/>
+              <w:right w:val="none" w:color="FFFFFF" w:sz="0"/>
+            </w:tcBorders>
+            <w:tcMar>
+              <w:top w:type="dxa" w:w="50"/>
+              <w:left w:type="dxa" w:w="90"/>
+              <w:bottom w:type="dxa" w:w="50"/>
+              <w:right w:type="dxa" w:w="90"/>
+            </w:tcMar>
+          </w:tcPr>
+          <w:p>
+            <w:pPr>
+              <w:spacing w:line="240" w:lineRule="auto"/>
+            </w:pPr>
+            <w:r>
+              <w:rPr>
+                <w:rFonts w:ascii="Times New Roman" w:cs="Times New Roman" w:eastAsia="Times New Roman" w:hAnsi="Times New Roman"/>
+                <w:b w:val="false"/>
+                <w:bCs w:val="false"/>
+                <w:sz w:val="20"/>
+                <w:szCs w:val="20"/>
+              </w:rPr>
+              <w:t xml:space="preserve">+0.029 (0.839)</w:t>
+            </w:r>
+          </w:p>
+        </w:tc>
+        <w:tc>
+          <w:tcPr>
+            <w:tcW w:type="dxa" w:w="1675"/>
+            <w:tcBorders>
+              <w:top w:val="none" w:color="FFFFFF" w:sz="0"/>
+              <w:left w:val="none" w:color="FFFFFF" w:sz="0"/>
+              <w:bottom w:val="none" w:color="FFFFFF" w:sz="0"/>
+              <w:right w:val="none" w:color="FFFFFF" w:sz="0"/>
+            </w:tcBorders>
+            <w:tcMar>
+              <w:top w:type="dxa" w:w="50"/>
+              <w:left w:type="dxa" w:w="90"/>
+              <w:bottom w:type="dxa" w:w="50"/>
+              <w:right w:type="dxa" w:w="90"/>
+            </w:tcMar>
+          </w:tcPr>
+          <w:p>
+            <w:pPr>
+              <w:spacing w:line="240" w:lineRule="auto"/>
+            </w:pPr>
+            <w:r>
+              <w:rPr>
+                <w:rFonts w:ascii="Times New Roman" w:cs="Times New Roman" w:eastAsia="Times New Roman" w:hAnsi="Times New Roman"/>
+                <w:b w:val="false"/>
+                <w:bCs w:val="false"/>
+                <w:sz w:val="20"/>
+                <w:szCs w:val="20"/>
+              </w:rPr>
+              <w:t xml:space="preserve">−0.333 (0.046)</w:t>
+            </w:r>
+          </w:p>
+        </w:tc>
+        <w:tc>
+          <w:tcPr>
+            <w:tcW w:type="dxa" w:w="1675"/>
+            <w:tcBorders>
+              <w:top w:val="none" w:color="FFFFFF" w:sz="0"/>
+              <w:left w:val="none" w:color="FFFFFF" w:sz="0"/>
+              <w:bottom w:val="none" w:color="FFFFFF" w:sz="0"/>
+              <w:right w:val="none" w:color="FFFFFF" w:sz="0"/>
+            </w:tcBorders>
+            <w:tcMar>
+              <w:top w:type="dxa" w:w="50"/>
+              <w:left w:type="dxa" w:w="90"/>
+              <w:bottom w:type="dxa" w:w="50"/>
+              <w:right w:type="dxa" w:w="90"/>
+            </w:tcMar>
+          </w:tcPr>
+          <w:p>
+            <w:pPr>
+              <w:spacing w:line="240" w:lineRule="auto"/>
+            </w:pPr>
+            <w:r>
+              <w:rPr>
+                <w:rFonts w:ascii="Times New Roman" w:cs="Times New Roman" w:eastAsia="Times New Roman" w:hAnsi="Times New Roman"/>
+                <w:b w:val="false"/>
+                <w:bCs w:val="false"/>
+                <w:sz w:val="20"/>
+                <w:szCs w:val="20"/>
+              </w:rPr>
+              <w:t xml:space="preserve">−0.473 (0.008)</w:t>
+            </w:r>
+          </w:p>
+        </w:tc>
+      </w:tr>
+      <w:tr>
+        <w:trPr>
+          <w:cantSplit/>
+          <w:tblHeader w:val="false"/>
+        </w:trPr>
+        <w:tc>
+          <w:tcPr>
+            <w:tcW w:type="dxa" w:w="2660"/>
+            <w:tcBorders>
+              <w:top w:val="none" w:color="FFFFFF" w:sz="0"/>
+              <w:left w:val="none" w:color="FFFFFF" w:sz="0"/>
+              <w:bottom w:val="single" w:color="000000" w:sz="4"/>
+              <w:right w:val="none" w:color="FFFFFF" w:sz="0"/>
+            </w:tcBorders>
+            <w:tcMar>
+              <w:top w:type="dxa" w:w="50"/>
+              <w:left w:type="dxa" w:w="90"/>
+              <w:bottom w:type="dxa" w:w="50"/>
+              <w:right w:type="dxa" w:w="90"/>
+            </w:tcMar>
+          </w:tcPr>
+          <w:p>
+            <w:pPr>
+              <w:spacing w:line="240" w:lineRule="auto"/>
+            </w:pPr>
+            <w:r>
+              <w:rPr>
+                <w:rFonts w:ascii="Times New Roman" w:cs="Times New Roman" w:eastAsia="Times New Roman" w:hAnsi="Times New Roman"/>
+                <w:b w:val="false"/>
+                <w:bCs w:val="false"/>
+                <w:sz w:val="20"/>
+                <w:szCs w:val="20"/>
+              </w:rPr>
+              <w:t xml:space="preserve">Text production (SOC 1–3)</w:t>
+            </w:r>
+          </w:p>
+        </w:tc>
+        <w:tc>
+          <w:tcPr>
+            <w:tcW w:type="dxa" w:w="1675"/>
+            <w:tcBorders>
+              <w:top w:val="none" w:color="FFFFFF" w:sz="0"/>
+              <w:left w:val="none" w:color="FFFFFF" w:sz="0"/>
+              <w:bottom w:val="single" w:color="000000" w:sz="4"/>
+              <w:right w:val="none" w:color="FFFFFF" w:sz="0"/>
+            </w:tcBorders>
+            <w:tcMar>
+              <w:top w:type="dxa" w:w="50"/>
+              <w:left w:type="dxa" w:w="90"/>
+              <w:bottom w:type="dxa" w:w="50"/>
+              <w:right w:type="dxa" w:w="90"/>
+            </w:tcMar>
+          </w:tcPr>
+          <w:p>
+            <w:pPr>
+              <w:spacing w:line="240" w:lineRule="auto"/>
+            </w:pPr>
+            <w:r>
+              <w:rPr>
+                <w:rFonts w:ascii="Times New Roman" w:cs="Times New Roman" w:eastAsia="Times New Roman" w:hAnsi="Times New Roman"/>
+                <w:b w:val="false"/>
+                <w:bCs w:val="false"/>
+                <w:sz w:val="20"/>
+                <w:szCs w:val="20"/>
+              </w:rPr>
+              <w:t xml:space="preserve">−0.119 (0.201)</w:t>
+            </w:r>
+          </w:p>
+        </w:tc>
+        <w:tc>
+          <w:tcPr>
+            <w:tcW w:type="dxa" w:w="1675"/>
+            <w:tcBorders>
+              <w:top w:val="none" w:color="FFFFFF" w:sz="0"/>
+              <w:left w:val="none" w:color="FFFFFF" w:sz="0"/>
+              <w:bottom w:val="single" w:color="000000" w:sz="4"/>
+              <w:right w:val="none" w:color="FFFFFF" w:sz="0"/>
+            </w:tcBorders>
+            <w:tcMar>
+              <w:top w:type="dxa" w:w="50"/>
+              <w:left w:type="dxa" w:w="90"/>
+              <w:bottom w:type="dxa" w:w="50"/>
+              <w:right w:type="dxa" w:w="90"/>
+            </w:tcMar>
+          </w:tcPr>
+          <w:p>
+            <w:pPr>
+              <w:spacing w:line="240" w:lineRule="auto"/>
+            </w:pPr>
+            <w:r>
+              <w:rPr>
+                <w:rFonts w:ascii="Times New Roman" w:cs="Times New Roman" w:eastAsia="Times New Roman" w:hAnsi="Times New Roman"/>
+                <w:b w:val="false"/>
+                <w:bCs w:val="false"/>
+                <w:sz w:val="20"/>
+                <w:szCs w:val="20"/>
+              </w:rPr>
+              <w:t xml:space="preserve">−0.003 (0.982)</w:t>
+            </w:r>
+          </w:p>
+        </w:tc>
+        <w:tc>
+          <w:tcPr>
+            <w:tcW w:type="dxa" w:w="1675"/>
+            <w:tcBorders>
+              <w:top w:val="none" w:color="FFFFFF" w:sz="0"/>
+              <w:left w:val="none" w:color="FFFFFF" w:sz="0"/>
+              <w:bottom w:val="single" w:color="000000" w:sz="4"/>
+              <w:right w:val="none" w:color="FFFFFF" w:sz="0"/>
+            </w:tcBorders>
+            <w:tcMar>
+              <w:top w:type="dxa" w:w="50"/>
+              <w:left w:type="dxa" w:w="90"/>
+              <w:bottom w:type="dxa" w:w="50"/>
+              <w:right w:type="dxa" w:w="90"/>
+            </w:tcMar>
+          </w:tcPr>
+          <w:p>
+            <w:pPr>
+              <w:spacing w:line="240" w:lineRule="auto"/>
+            </w:pPr>
+            <w:r>
+              <w:rPr>
+                <w:rFonts w:ascii="Times New Roman" w:cs="Times New Roman" w:eastAsia="Times New Roman" w:hAnsi="Times New Roman"/>
+                <w:b w:val="false"/>
+                <w:bCs w:val="false"/>
+                <w:sz w:val="20"/>
+                <w:szCs w:val="20"/>
+              </w:rPr>
+              <w:t xml:space="preserve">−0.336 (0.049)</w:t>
+            </w:r>
+          </w:p>
+        </w:tc>
+        <w:tc>
+          <w:tcPr>
+            <w:tcW w:type="dxa" w:w="1675"/>
+            <w:tcBorders>
+              <w:top w:val="none" w:color="FFFFFF" w:sz="0"/>
+              <w:left w:val="none" w:color="FFFFFF" w:sz="0"/>
+              <w:bottom w:val="single" w:color="000000" w:sz="4"/>
+              <w:right w:val="none" w:color="FFFFFF" w:sz="0"/>
+            </w:tcBorders>
+            <w:tcMar>
+              <w:top w:type="dxa" w:w="50"/>
+              <w:left w:type="dxa" w:w="90"/>
+              <w:bottom w:type="dxa" w:w="50"/>
+              <w:right w:type="dxa" w:w="90"/>
+            </w:tcMar>
+          </w:tcPr>
+          <w:p>
+            <w:pPr>
+              <w:spacing w:line="240" w:lineRule="auto"/>
+            </w:pPr>
+            <w:r>
+              <w:rPr>
+                <w:rFonts w:ascii="Times New Roman" w:cs="Times New Roman" w:eastAsia="Times New Roman" w:hAnsi="Times New Roman"/>
+                <w:b w:val="false"/>
+                <w:bCs w:val="false"/>
+                <w:sz w:val="20"/>
+                <w:szCs w:val="20"/>
+              </w:rPr>
+              <w:t xml:space="preserve">−0.478 (0.005)</w:t>
+            </w:r>
+          </w:p>
+        </w:tc>
+      </w:tr>
+    </w:tbl>
+    <w:p>
+      <w:pPr>
+        <w:spacing w:after="200" w:before="60" w:line="240" w:lineRule="auto"/>
+      </w:pPr>
+      <w:r>
+        <w:rPr>
+          <w:rFonts w:ascii="Times New Roman" w:cs="Times New Roman" w:eastAsia="Times New Roman" w:hAnsi="Times New Roman"/>
+          <w:i/>
+          <w:iCs/>
+          <w:sz w:val="20"/>
+          <w:szCs w:val="20"/>
+        </w:rPr>
+        <w:t xml:space="preserve">Note.</w:t>
+      </w:r>
+      <w:r>
+        <w:rPr>
+          <w:rFonts w:ascii="Times New Roman" w:cs="Times New Roman" w:eastAsia="Times New Roman" w:hAnsi="Times New Roman"/>
+          <w:sz w:val="20"/>
+          <w:szCs w:val="20"/>
+        </w:rPr>
+        <w:t xml:space="preserve"> Entries are the mean log change of the group minus that of the comparison pool, with randomization p-values in parentheses. Comparison pools: all other occupations with at least 1,000 new adverts in the base year (395), and the subset in SOC major groups 1 to 3 (249). Months with missing cells are interpolated (see text). The last column includes the imputed month of March 2026.</w:t>
+      </w:r>
+    </w:p>
+    <w:p>
+      <w:pPr>
+        <w:spacing w:after="0" w:line="480" w:lineRule="auto"/>
+        <w:ind w:firstLine="720"/>
+        <w:jc w:val="left"/>
+      </w:pPr>
+      <w:r>
+        <w:rPr>
+          <w:rFonts w:ascii="Times New Roman" w:cs="Times New Roman" w:eastAsia="Times New Roman" w:hAnsi="Times New Roman"/>
+          <w:sz w:val="24"/>
+          <w:szCs w:val="24"/>
+        </w:rPr>
+        <w:t xml:space="preserve">Four checks limit the interpretation. First, the decline in image and video production is concentrated in some occupations. Web design professionals fell most, ranking first or third among 405 occupations in the later years (log changes of −1.45 and −1.36 against a comparison median of −0.43 and −0.46), and graphic and multimedia designers ranked 32nd to 38th (−0.86 and −0.89). Artists and photographers were close to the median. When web design professionals are dropped, the third- and fourth-year differences fall to −0.16 and −0.21. Second, the placebo design occupations also fell relative to others (−0.16, −0.20, and −0.06 in the first, third, and fourth years), so the fall in design hiring is not specific to occupations that image generators target. Third, the pre-period is contaminated by COVID: image and video production fell by 0.32 log points relative to other occupations between June 2019 and June 2021 (the creative direction and text groups fell by 0.36 and 0.31), so these groups were already losing ground before generative AI. Fourth, the timing does not show steps at release dates; the gap widens gradually, and the decline of text production occurs later than that of image production, which is the opposite of the order in which the public text and image tools appeared.</w:t>
+      </w:r>
+    </w:p>
+    <w:p>
+      <w:pPr>
+        <w:pStyle w:val="Heading2"/>
+        <w:keepNext/>
+        <w:spacing w:after="120" w:before="240" w:line="240" w:lineRule="auto"/>
+      </w:pPr>
+      <w:r>
+        <w:rPr>
+          <w:rFonts w:ascii="Times New Roman" w:cs="Times New Roman" w:eastAsia="Times New Roman" w:hAnsi="Times New Roman"/>
+          <w:b/>
+          <w:bCs/>
+          <w:sz w:val="24"/>
+          <w:szCs w:val="24"/>
+        </w:rPr>
+        <w:t xml:space="preserve">6.2 US Postings</w:t>
+      </w:r>
+    </w:p>
+    <w:p>
+      <w:pPr>
+        <w:spacing w:after="0" w:line="480" w:lineRule="auto"/>
+        <w:ind w:firstLine="720"/>
+        <w:jc w:val="left"/>
+      </w:pPr>
+      <w:r>
+        <w:rPr>
+          <w:rFonts w:ascii="Times New Roman" w:cs="Times New Roman" w:eastAsia="Times New Roman" w:hAnsi="Times New Roman"/>
+          <w:sz w:val="24"/>
+          <w:szCs w:val="24"/>
+        </w:rPr>
+        <w:t xml:space="preserve">Table 3 reports the difference in log change between creative and other sectors. Creative sectors fell relative to other sectors in every window after the base. The difference is −0.23 log points in October 2022–March 2023 (randomization p = 0.018) and about −0.31 to −0.33 in later windows (p between 0.049 and 0.077) when all other sectors are the comparison. When the technology and data sectors are excluded from the comparison, the differences are larger and the p-values smaller (−0.26 to −0.39, p between 0.003 and 0.011). The difference between the third and second windows is close to zero (−0.316 versus −0.328 for all other sectors), so there is no additional widening after the release of video-generation systems.</w:t>
+      </w:r>
+    </w:p>
+    <w:p>
+      <w:pPr>
+        <w:keepNext/>
+        <w:spacing w:after="80" w:before="240" w:line="240" w:lineRule="auto"/>
+        <w:jc w:val="center"/>
+      </w:pPr>
+      <w:r>
+        <w:rPr>
+          <w:rFonts w:ascii="Times New Roman" w:cs="Times New Roman" w:eastAsia="Times New Roman" w:hAnsi="Times New Roman"/>
+          <w:b/>
+          <w:bCs/>
+          <w:sz w:val="22"/>
+          <w:szCs w:val="22"/>
+        </w:rPr>
+        <w:t xml:space="preserve">Table 3.</w:t>
       </w:r>
       <w:r>
         <w:rPr>
@@ -2309,7 +3717,7 @@
           <w:sz w:val="24"/>
           <w:szCs w:val="24"/>
         </w:rPr>
-        <w:t xml:space="preserve">6.2 European Industry Employment</w:t>
+        <w:t xml:space="preserve">6.3 European Industry Employment</w:t>
       </w:r>
     </w:p>
     <w:p>
@@ -2341,7 +3749,7 @@
           <w:sz w:val="22"/>
           <w:szCs w:val="22"/>
         </w:rPr>
-        <w:t xml:space="preserve">Table 3.</w:t>
+        <w:t xml:space="preserve">Table 4.</w:t>
       </w:r>
       <w:r>
         <w:rPr>
@@ -2818,7 +4226,7 @@
           <w:sz w:val="24"/>
           <w:szCs w:val="24"/>
         </w:rPr>
-        <w:t xml:space="preserve">6.3 What the Evidence Does and Does Not Show</w:t>
+        <w:t xml:space="preserve">6.4 What the Evidence Does and Does Not Show</w:t>
       </w:r>
     </w:p>
     <w:p>
@@ -2833,7 +4241,7 @@
           <w:sz w:val="24"/>
           <w:szCs w:val="24"/>
         </w:rPr>
-        <w:t xml:space="preserve">For H1, US postings are directionally consistent with substitution, but the decline is no larger than that in technology sectors and the pre-trend is not flat. European employment shows no decline. For H4, there is no widening after video-generation releases in US postings. For H3, the European employment result is compatible with a scale effect, but the test is weak because treated activities are heterogeneous and the data do not show job content. H2 cannot be tested at all, since neither source has occupations. Overall, the exploratory evidence does not reject a null of no displacement of creative labor, and it does not support it either. The binding limitation is the aggregate, sector-level nature of the data, not the sign of any estimate.</w:t>
+        <w:t xml:space="preserve">For H1, UK adverts by occupation are directionally consistent with substitution in image and video production, and US sector postings and UK placebo design occupations show that the decline is not specific to visual generation. European employment shows no decline. For H2, the contrast between production and creative-direction occupations has the predicted sign but is not statistically distinguishable from zero and rests on three direction occupations. For H3, European employment is compatible with a scale effect, but the test is weak because activities are broad. For H4, no step appears at video-generation releases in any source, and the later decline of text production than of image production does not fit a simple release-order story. Overall, the evidence is consistent with a relative decline in hiring for image and video production work, concentrated in web and graphic design, but it does not identify an effect of generative AI, because design occupations unrelated to image generation also declined and the pre-period already shows relative decline. The binding limitation is the identification, not the sign of any estimate.</w:t>
       </w:r>
     </w:p>
     <w:p>
@@ -2850,7 +4258,7 @@
           <w:sz w:val="24"/>
           <w:szCs w:val="24"/>
         </w:rPr>
-        <w:t xml:space="preserve">6.4 Pre-Specified Occupation-Level Tests</w:t>
+        <w:t xml:space="preserve">6.5 Pre-Specified Tests for Richer Data</w:t>
       </w:r>
     </w:p>
     <w:p>
@@ -2865,7 +4273,7 @@
           <w:sz w:val="24"/>
           <w:szCs w:val="24"/>
         </w:rPr>
-        <w:t xml:space="preserve">With occupation-level posting data (for example, postings classified by occupation and quarter), the model implies the following tests, which we pre-specify here. Occupations with a high share of tasks scoring 2 on the visual content creation measure should show a larger fall in postings after each release than comparable occupations with low scores (H1), and the fall should be larger within the group where acceptance thresholds are likely to be low, such as stock imagery and routine graphics (H2). The share of postings requiring direction, curation, and integration skills should rise in creative occupations (H3). Differences should widen after video-generation releases for video-related occupations (H4). Comparison groups should have similar exposure to text-generation tools but low visual content production, so that the visual channel can be separated from the text channel.</w:t>
+        <w:t xml:space="preserve">With posting data that include occupations, tasks, and employers (for example, licensed data with skills and firm identifiers), the model implies the following tests, which we pre-specify here. Occupations with a high share of tasks scoring 2 on the visual content creation measure should show a larger fall in postings after each release than comparable occupations with low scores (H1), and the fall should be larger within the group where acceptance thresholds are likely to be low, such as stock imagery and routine graphics (H2). The share of postings requiring direction, curation, and integration skills should rise in creative occupations (H3). Differences should widen after video-generation releases for video-related occupations (H4). Comparison groups should have similar exposure to text-generation tools but low visual content production, so that the visual channel can be separated from the text channel.</w:t>
       </w:r>
     </w:p>
     <w:p>
@@ -2915,7 +4323,7 @@
           <w:sz w:val="24"/>
           <w:szCs w:val="24"/>
         </w:rPr>
-        <w:t xml:space="preserve">The paper offers a task-level model of generative visual AI in which the acceptance rate relative to a review-cost threshold, rather than task volume, governs substitution, and in which a scale effect can offset or exceed substitution in sector employment. It proposes a measure of visual content creation based on O*NET tasks and a design for occupation-level tests. It also reports exploratory evidence from open aggregate data. The evidence is mixed and it identifies no effect of generative visual AI on creative labor.</w:t>
+        <w:t xml:space="preserve">The paper offers a task-level model of generative visual AI in which the acceptance rate relative to a review-cost threshold, rather than task volume, governs substitution, and in which a scale effect can offset or exceed substitution in sector employment. It proposes a measure of visual content creation based on O*NET tasks and a design for occupation-level tests. It also reports exploratory evidence from three open data sources. The evidence shows a relative decline in hiring for image and video production occupations in the UK, but it identifies no effect of generative visual AI on creative labor.</w:t>
       </w:r>
     </w:p>
     <w:p>
@@ -2979,7 +4387,7 @@
           <w:sz w:val="24"/>
           <w:szCs w:val="24"/>
         </w:rPr>
-        <w:t xml:space="preserve">The data are aggregate. US postings are by sector, which mixes visual and text-producing roles, and European employment is by broad industry. Neither observes occupations, firms, or tasks. The treated groups are chosen a priori and are coarse. The sample of treated units is three in each source, and inference relies on randomization over sector sets. Concurrent shocks, including the post-pandemic recovery, higher interest rates, a slowdown in technology hiring, and text-generation tools, cannot be separated from image generation. Postings measure hiring intent and not employment, and the Labour Force Survey includes the self-employed, who may respond differently. Model release dates are approximate and must be verified. The visual content creation measure is not yet validated against human coders. The theoretical model is a stylized single-asset model and abstracts from changes in the quality and variety of assets.</w:t>
+        <w:t xml:space="preserve">The UK data are by occupation but not by firm or task, are experimental, and have missing months that we interpolate. US postings are by sector, which mixes visual and text-producing roles, and European employment is by broad industry. The treated groups are chosen a priori from labels and are coarse: there are four production, three direction, and three text occupations in the UK data, and three treated units in each of the other sources, so inference relies on randomization over occupation or sector sets. Concurrent shocks, including the post-pandemic recovery, higher interest rates, a slowdown in technology hiring, and text-generation tools, cannot be separated from image generation. Postings measure hiring intent and not employment, and the Labour Force Survey includes the self-employed, who may respond differently. Model release dates are approximate and must be verified. The visual content creation measure is not yet validated against human coders. The pre-period contains the COVID shock, so parallel trends cannot be tested cleanly. The theoretical model is a stylized single-asset model and abstracts from changes in the quality and variety of assets.</w:t>
       </w:r>
     </w:p>
     <w:p>
@@ -3012,7 +4420,7 @@
           <w:sz w:val="24"/>
           <w:szCs w:val="24"/>
         </w:rPr>
-        <w:t xml:space="preserve">Generative AI makes visual content cheap to produce, but the effect on creative labor depends on whether output is good enough and on whether cheaper content creates enough extra demand. In open aggregate data we find that US creative-sector postings fell after 2022 by about as much as technology-sector postings, and that European creative-industry employment did not fall, so we cannot attribute a labor effect to generative visual AI. Testing the model’s distinct predictions requires occupation-level data and a validated task measure, which we specify.</w:t>
+        <w:t xml:space="preserve">Generative AI makes visual content cheap to produce, but the effect on creative labor depends on whether output is good enough and on whether cheaper content creates enough extra demand. In open data we find that UK adverts for image and video production occupations fell relative to other occupations after mid-2022, concentrated in web and graphic design, that US creative-sector postings fell by about as much as technology-sector postings, and that European creative-industry employment did not fall. Because design occupations that image generators do not target also declined and the production occupations were already declining before 2022, we cannot attribute the decline to generative visual AI. Testing the model’s distinct predictions requires firm-level data and a validated task measure, which we specify.</w:t>
       </w:r>
     </w:p>
     <w:p>
@@ -3206,6 +4614,20 @@
           <w:szCs w:val="24"/>
         </w:rPr>
         <w:t xml:space="preserve">NET Database, version 29.1 (Task Statements; Abilities). Creative Commons Attribution 4.0 International License.</w:t>
+      </w:r>
+    </w:p>
+    <w:p>
+      <w:pPr>
+        <w:spacing w:after="120" w:line="240" w:lineRule="auto"/>
+        <w:ind w:left="720" w:hanging="720"/>
+      </w:pPr>
+      <w:r>
+        <w:rPr>
+          <w:rFonts w:ascii="Times New Roman" w:cs="Times New Roman" w:eastAsia="Times New Roman" w:hAnsi="Times New Roman"/>
+          <w:sz w:val="24"/>
+          <w:szCs w:val="24"/>
+        </w:rPr>
+        <w:t xml:space="preserve">Office for National Statistics. Labour demand volumes by Standard Occupation Classification (SOC 2020), UK: January 2017 to August 2026 (experimental statistics based on Textkernel data). Open Government Licence.</w:t>
       </w:r>
     </w:p>
     <w:p>

</xml_diff>